<commit_message>
fix: Correcciones de responsividad movil - pb-nav, z-index del drawer, glitch que temblaba, altura de imagenes, scroll sin limite
</commit_message>
<xml_diff>
--- a/ZODI IMAGENES/detalle trabajado.docx
+++ b/ZODI IMAGENES/detalle trabajado.docx
@@ -171,7 +171,7 @@
     <w:p>
       <w:r>
         <w:pict w14:anchorId="40B5A958">
-          <v:rect id="_x0000_i1163" style="width:0;height:1.5pt" o:hralign="center" o:hrstd="t" o:hr="t" fillcolor="#a0a0a0" stroked="f"/>
+          <v:rect id="_x0000_i1025" style="width:0;height:1.5pt" o:hralign="center" o:hrstd="t" o:hr="t" fillcolor="#a0a0a0" stroked="f"/>
         </w:pict>
       </w:r>
     </w:p>
@@ -644,7 +644,7 @@
       <w:r>
         <w:lastRenderedPageBreak/>
         <w:pict w14:anchorId="142E6B70">
-          <v:rect id="_x0000_i1164" style="width:0;height:1.5pt" o:hralign="center" o:hrstd="t" o:hr="t" fillcolor="#a0a0a0" stroked="f"/>
+          <v:rect id="_x0000_i1026" style="width:0;height:1.5pt" o:hralign="center" o:hrstd="t" o:hr="t" fillcolor="#a0a0a0" stroked="f"/>
         </w:pict>
       </w:r>
     </w:p>
@@ -1248,7 +1248,7 @@
     <w:p>
       <w:r>
         <w:pict w14:anchorId="53DC72B1">
-          <v:rect id="_x0000_i1165" style="width:0;height:1.5pt" o:hralign="center" o:hrstd="t" o:hr="t" fillcolor="#a0a0a0" stroked="f"/>
+          <v:rect id="_x0000_i1027" style="width:0;height:1.5pt" o:hralign="center" o:hrstd="t" o:hr="t" fillcolor="#a0a0a0" stroked="f"/>
         </w:pict>
       </w:r>
     </w:p>
@@ -1841,7 +1841,7 @@
     <w:p>
       <w:r>
         <w:pict w14:anchorId="4B28C352">
-          <v:rect id="_x0000_i1166" style="width:0;height:1.5pt" o:hralign="center" o:hrstd="t" o:hr="t" fillcolor="#a0a0a0" stroked="f"/>
+          <v:rect id="_x0000_i1028" style="width:0;height:1.5pt" o:hralign="center" o:hrstd="t" o:hr="t" fillcolor="#a0a0a0" stroked="f"/>
         </w:pict>
       </w:r>
     </w:p>
@@ -2660,7 +2660,7 @@
     <w:p>
       <w:r>
         <w:pict w14:anchorId="75DA0484">
-          <v:rect id="_x0000_i1167" style="width:0;height:1.5pt" o:hralign="center" o:hrstd="t" o:hr="t" fillcolor="#a0a0a0" stroked="f"/>
+          <v:rect id="_x0000_i1029" style="width:0;height:1.5pt" o:hralign="center" o:hrstd="t" o:hr="t" fillcolor="#a0a0a0" stroked="f"/>
         </w:pict>
       </w:r>
     </w:p>
@@ -3339,7 +3339,7 @@
     <w:p>
       <w:r>
         <w:pict w14:anchorId="47EC3317">
-          <v:rect id="_x0000_i1168" style="width:0;height:1.5pt" o:hralign="center" o:hrstd="t" o:hr="t" fillcolor="#a0a0a0" stroked="f"/>
+          <v:rect id="_x0000_i1030" style="width:0;height:1.5pt" o:hralign="center" o:hrstd="t" o:hr="t" fillcolor="#a0a0a0" stroked="f"/>
         </w:pict>
       </w:r>
     </w:p>
@@ -4310,7 +4310,7 @@
     <w:p>
       <w:r>
         <w:pict w14:anchorId="4B70CC00">
-          <v:rect id="_x0000_i1169" style="width:0;height:1.5pt" o:hralign="center" o:hrstd="t" o:hr="t" fillcolor="#a0a0a0" stroked="f"/>
+          <v:rect id="_x0000_i1031" style="width:0;height:1.5pt" o:hralign="center" o:hrstd="t" o:hr="t" fillcolor="#a0a0a0" stroked="f"/>
         </w:pict>
       </w:r>
     </w:p>
@@ -5531,7 +5531,7 @@
     <w:p>
       <w:r>
         <w:pict w14:anchorId="414F0340">
-          <v:rect id="_x0000_i1170" style="width:0;height:1.5pt" o:hralign="center" o:hrstd="t" o:hr="t" fillcolor="#a0a0a0" stroked="f"/>
+          <v:rect id="_x0000_i1032" style="width:0;height:1.5pt" o:hralign="center" o:hrstd="t" o:hr="t" fillcolor="#a0a0a0" stroked="f"/>
         </w:pict>
       </w:r>
     </w:p>
@@ -6138,7 +6138,7 @@
     <w:p>
       <w:r>
         <w:pict w14:anchorId="0F3C93A2">
-          <v:rect id="_x0000_i1171" style="width:0;height:1.5pt" o:hralign="center" o:hrstd="t" o:hr="t" fillcolor="#a0a0a0" stroked="f"/>
+          <v:rect id="_x0000_i1033" style="width:0;height:1.5pt" o:hralign="center" o:hrstd="t" o:hr="t" fillcolor="#a0a0a0" stroked="f"/>
         </w:pict>
       </w:r>
     </w:p>
@@ -6914,7 +6914,7 @@
     <w:p>
       <w:r>
         <w:pict w14:anchorId="21F8581D">
-          <v:rect id="_x0000_i1172" style="width:0;height:1.5pt" o:hralign="center" o:hrstd="t" o:hr="t" fillcolor="#a0a0a0" stroked="f"/>
+          <v:rect id="_x0000_i1034" style="width:0;height:1.5pt" o:hralign="center" o:hrstd="t" o:hr="t" fillcolor="#a0a0a0" stroked="f"/>
         </w:pict>
       </w:r>
     </w:p>
@@ -7445,7 +7445,7 @@
     <w:p>
       <w:r>
         <w:pict w14:anchorId="4F591518">
-          <v:rect id="_x0000_i1173" style="width:0;height:1.5pt" o:hralign="center" o:hrstd="t" o:hr="t" fillcolor="#a0a0a0" stroked="f"/>
+          <v:rect id="_x0000_i1035" style="width:0;height:1.5pt" o:hralign="center" o:hrstd="t" o:hr="t" fillcolor="#a0a0a0" stroked="f"/>
         </w:pict>
       </w:r>
     </w:p>
@@ -7985,7 +7985,7 @@
       <w:r>
         <w:lastRenderedPageBreak/>
         <w:pict w14:anchorId="278B1B47">
-          <v:rect id="_x0000_i1174" style="width:0;height:1.5pt" o:hralign="center" o:hrstd="t" o:hr="t" fillcolor="#a0a0a0" stroked="f"/>
+          <v:rect id="_x0000_i1036" style="width:0;height:1.5pt" o:hralign="center" o:hrstd="t" o:hr="t" fillcolor="#a0a0a0" stroked="f"/>
         </w:pict>
       </w:r>
     </w:p>
@@ -8940,7 +8940,7 @@
     <w:p>
       <w:r>
         <w:pict w14:anchorId="1EA2394E">
-          <v:rect id="_x0000_i1175" style="width:0;height:1.5pt" o:hralign="center" o:hrstd="t" o:hr="t" fillcolor="#a0a0a0" stroked="f"/>
+          <v:rect id="_x0000_i1037" style="width:0;height:1.5pt" o:hralign="center" o:hrstd="t" o:hr="t" fillcolor="#a0a0a0" stroked="f"/>
         </w:pict>
       </w:r>
     </w:p>
@@ -9481,7 +9481,7 @@
     <w:p>
       <w:r>
         <w:pict w14:anchorId="507D15E4">
-          <v:rect id="_x0000_i1176" style="width:0;height:1.5pt" o:hralign="center" o:hrstd="t" o:hr="t" fillcolor="#a0a0a0" stroked="f"/>
+          <v:rect id="_x0000_i1038" style="width:0;height:1.5pt" o:hralign="center" o:hrstd="t" o:hr="t" fillcolor="#a0a0a0" stroked="f"/>
         </w:pict>
       </w:r>
     </w:p>
@@ -10013,7 +10013,7 @@
     <w:p>
       <w:r>
         <w:pict w14:anchorId="69BD9A47">
-          <v:rect id="_x0000_i1177" style="width:0;height:1.5pt" o:hralign="center" o:hrstd="t" o:hr="t" fillcolor="#a0a0a0" stroked="f"/>
+          <v:rect id="_x0000_i1039" style="width:0;height:1.5pt" o:hralign="center" o:hrstd="t" o:hr="t" fillcolor="#a0a0a0" stroked="f"/>
         </w:pict>
       </w:r>
     </w:p>
@@ -10764,7 +10764,7 @@
     <w:p>
       <w:r>
         <w:pict w14:anchorId="29D47674">
-          <v:rect id="_x0000_i1178" style="width:0;height:1.5pt" o:hralign="center" o:hrstd="t" o:hr="t" fillcolor="#a0a0a0" stroked="f"/>
+          <v:rect id="_x0000_i1040" style="width:0;height:1.5pt" o:hralign="center" o:hrstd="t" o:hr="t" fillcolor="#a0a0a0" stroked="f"/>
         </w:pict>
       </w:r>
     </w:p>
@@ -10916,7 +10916,7 @@
     <w:p>
       <w:r>
         <w:pict w14:anchorId="56D0FFC1">
-          <v:rect id="_x0000_i1179" style="width:0;height:1.5pt" o:hralign="center" o:hrstd="t" o:hr="t" fillcolor="#a0a0a0" stroked="f"/>
+          <v:rect id="_x0000_i1041" style="width:0;height:1.5pt" o:hralign="center" o:hrstd="t" o:hr="t" fillcolor="#a0a0a0" stroked="f"/>
         </w:pict>
       </w:r>
     </w:p>
@@ -11103,7 +11103,7 @@
     <w:p>
       <w:r>
         <w:pict w14:anchorId="2AF0711F">
-          <v:rect id="_x0000_i1180" style="width:0;height:1.5pt" o:hralign="center" o:hrstd="t" o:hr="t" fillcolor="#a0a0a0" stroked="f"/>
+          <v:rect id="_x0000_i1042" style="width:0;height:1.5pt" o:hralign="center" o:hrstd="t" o:hr="t" fillcolor="#a0a0a0" stroked="f"/>
         </w:pict>
       </w:r>
     </w:p>
@@ -11248,7 +11248,7 @@
     <w:p>
       <w:r>
         <w:pict w14:anchorId="65307C37">
-          <v:rect id="_x0000_i1181" style="width:0;height:1.5pt" o:hralign="center" o:hrstd="t" o:hr="t" fillcolor="#a0a0a0" stroked="f"/>
+          <v:rect id="_x0000_i1043" style="width:0;height:1.5pt" o:hralign="center" o:hrstd="t" o:hr="t" fillcolor="#a0a0a0" stroked="f"/>
         </w:pict>
       </w:r>
     </w:p>
@@ -11358,7 +11358,7 @@
     <w:p>
       <w:r>
         <w:pict w14:anchorId="101A2E8A">
-          <v:rect id="_x0000_i1182" style="width:0;height:1.5pt" o:hralign="center" o:hrstd="t" o:hr="t" fillcolor="#a0a0a0" stroked="f"/>
+          <v:rect id="_x0000_i1044" style="width:0;height:1.5pt" o:hralign="center" o:hrstd="t" o:hr="t" fillcolor="#a0a0a0" stroked="f"/>
         </w:pict>
       </w:r>
     </w:p>
@@ -11472,7 +11472,7 @@
     <w:p>
       <w:r>
         <w:pict w14:anchorId="57780E77">
-          <v:rect id="_x0000_i1183" style="width:0;height:1.5pt" o:hralign="center" o:hrstd="t" o:hr="t" fillcolor="#a0a0a0" stroked="f"/>
+          <v:rect id="_x0000_i1045" style="width:0;height:1.5pt" o:hralign="center" o:hrstd="t" o:hr="t" fillcolor="#a0a0a0" stroked="f"/>
         </w:pict>
       </w:r>
     </w:p>
@@ -11567,7 +11567,7 @@
     <w:p>
       <w:r>
         <w:pict w14:anchorId="33CFDD1F">
-          <v:rect id="_x0000_i1184" style="width:0;height:1.5pt" o:hralign="center" o:hrstd="t" o:hr="t" fillcolor="#a0a0a0" stroked="f"/>
+          <v:rect id="_x0000_i1046" style="width:0;height:1.5pt" o:hralign="center" o:hrstd="t" o:hr="t" fillcolor="#a0a0a0" stroked="f"/>
         </w:pict>
       </w:r>
     </w:p>
@@ -12074,7 +12074,7 @@
     <w:p>
       <w:r>
         <w:pict w14:anchorId="4862CBB2">
-          <v:rect id="_x0000_i1185" style="width:0;height:1.5pt" o:hralign="center" o:hrstd="t" o:hr="t" fillcolor="#a0a0a0" stroked="f"/>
+          <v:rect id="_x0000_i1047" style="width:0;height:1.5pt" o:hralign="center" o:hrstd="t" o:hr="t" fillcolor="#a0a0a0" stroked="f"/>
         </w:pict>
       </w:r>
     </w:p>
@@ -13446,6 +13446,7 @@
   <w:style w:type="character" w:default="1" w:styleId="Fuentedeprrafopredeter">
     <w:name w:val="Default Paragraph Font"/>
     <w:uiPriority w:val="1"/>
+    <w:semiHidden/>
     <w:unhideWhenUsed/>
   </w:style>
   <w:style w:type="table" w:default="1" w:styleId="Tablanormal">

</xml_diff>